<commit_message>
gamd motion brief docx: body 12 pt as typst sets it (was 13 pt, an EB Garamond leftover; the style comment had been copied from the complaint)
docx check.sh: 10 passed, 0 failed (XENG-001, report only in this folder, no longer passes by chance: 8 docx pages
against 9 typst; at 13 pt the counts had matched). (fb-595.68.39)
</commit_message>
<xml_diff>
--- a/courts/eleventh-circuit/georgia/federal/middle-district/motion-brief/docx/reference.docx
+++ b/courts/eleventh-circuit/georgia/federal/middle-district/motion-brief/docx/reference.docx
@@ -198,13 +198,13 @@
 
 <file path=word/styles.xml><?xml version="1.0" encoding="utf-8"?>
 <w:styles xmlns:w="http://schemas.openxmlformats.org/wordprocessingml/2006/main">
-  <!-- gamd complaint: Times New Roman 14 pt, double spacing as an exact 32 pt pitch (typst template: pitch = 32pt). -->
+  <!-- gamd motion brief: Times New Roman 12 pt, double spacing as an exact 27.6 pt pitch (typst template: pitch = 27.6pt). -->
   <w:docDefaults>
     <w:rPrDefault>
       <w:rPr>
         <w:rFonts w:ascii="Times New Roman" w:hAnsi="Times New Roman" w:eastAsia="Times New Roman" w:cs="Times New Roman"/>
-        <w:sz w:val="26"/>
-        <w:szCs w:val="26"/>
+        <w:sz w:val="24"/>
+        <w:szCs w:val="24"/>
         <w:lang w:val="en-US" w:eastAsia="en-US" w:bidi="ar-SA"/>
       </w:rPr>
     </w:rPrDefault>

</xml_diff>